<commit_message>
fix: sanitize annual report sample OOXML ordering
</commit_message>
<xml_diff>
--- a/assets/showcase/annual-report.docx
+++ b/assets/showcase/annual-report.docx
@@ -946,47 +946,47 @@
       <w:jc w:val="center"/>
       <w:rPr>
         <w:rFonts w:ascii="Calibri" w:hAnsi="Calibri" w:eastAsia="Calibri"/>
+        <w:color w:val="999999"/>
         <w:sz w:val="18"/>
-        <w:color w:val="999999"/>
       </w:rPr>
     </w:pPr>
     <w:r>
       <w:rPr>
         <w:rFonts w:ascii="Calibri" w:hAnsi="Calibri" w:eastAsia="Calibri"/>
+        <w:color w:val="999999"/>
         <w:sz w:val="18"/>
-        <w:color w:val="999999"/>
       </w:rPr>
       <w:fldChar w:fldCharType="begin"/>
     </w:r>
     <w:r>
       <w:rPr>
         <w:rFonts w:ascii="Calibri" w:hAnsi="Calibri" w:eastAsia="Calibri"/>
+        <w:color w:val="999999"/>
         <w:sz w:val="18"/>
-        <w:color w:val="999999"/>
       </w:rPr>
       <w:instrText xml:space="preserve"> PAGE </w:instrText>
     </w:r>
     <w:r>
       <w:rPr>
         <w:rFonts w:ascii="Calibri" w:hAnsi="Calibri" w:eastAsia="Calibri"/>
+        <w:color w:val="999999"/>
         <w:sz w:val="18"/>
-        <w:color w:val="999999"/>
       </w:rPr>
       <w:fldChar w:fldCharType="separate"/>
     </w:r>
     <w:r>
       <w:rPr>
         <w:rFonts w:ascii="Calibri" w:hAnsi="Calibri" w:eastAsia="Calibri"/>
+        <w:color w:val="999999"/>
         <w:sz w:val="18"/>
-        <w:color w:val="999999"/>
       </w:rPr>
       <w:t xml:space="preserve">1</w:t>
     </w:r>
     <w:r>
       <w:rPr>
         <w:rFonts w:ascii="Calibri" w:hAnsi="Calibri" w:eastAsia="Calibri"/>
+        <w:color w:val="999999"/>
         <w:sz w:val="18"/>
-        <w:color w:val="999999"/>
       </w:rPr>
       <w:fldChar w:fldCharType="end"/>
     </w:r>

</xml_diff>

<commit_message>
fix: sanitize docx showcase samples to schema-clean baseline (#45)
* test: capture DOCX showcase baseline validation expectations

* fix: sanitize annual report sample OOXML ordering

* fix: sanitize academic paper styles baseline
</commit_message>
<xml_diff>
--- a/assets/showcase/annual-report.docx
+++ b/assets/showcase/annual-report.docx
@@ -946,47 +946,47 @@
       <w:jc w:val="center"/>
       <w:rPr>
         <w:rFonts w:ascii="Calibri" w:hAnsi="Calibri" w:eastAsia="Calibri"/>
+        <w:color w:val="999999"/>
         <w:sz w:val="18"/>
-        <w:color w:val="999999"/>
       </w:rPr>
     </w:pPr>
     <w:r>
       <w:rPr>
         <w:rFonts w:ascii="Calibri" w:hAnsi="Calibri" w:eastAsia="Calibri"/>
+        <w:color w:val="999999"/>
         <w:sz w:val="18"/>
-        <w:color w:val="999999"/>
       </w:rPr>
       <w:fldChar w:fldCharType="begin"/>
     </w:r>
     <w:r>
       <w:rPr>
         <w:rFonts w:ascii="Calibri" w:hAnsi="Calibri" w:eastAsia="Calibri"/>
+        <w:color w:val="999999"/>
         <w:sz w:val="18"/>
-        <w:color w:val="999999"/>
       </w:rPr>
       <w:instrText xml:space="preserve"> PAGE </w:instrText>
     </w:r>
     <w:r>
       <w:rPr>
         <w:rFonts w:ascii="Calibri" w:hAnsi="Calibri" w:eastAsia="Calibri"/>
+        <w:color w:val="999999"/>
         <w:sz w:val="18"/>
-        <w:color w:val="999999"/>
       </w:rPr>
       <w:fldChar w:fldCharType="separate"/>
     </w:r>
     <w:r>
       <w:rPr>
         <w:rFonts w:ascii="Calibri" w:hAnsi="Calibri" w:eastAsia="Calibri"/>
+        <w:color w:val="999999"/>
         <w:sz w:val="18"/>
-        <w:color w:val="999999"/>
       </w:rPr>
       <w:t xml:space="preserve">1</w:t>
     </w:r>
     <w:r>
       <w:rPr>
         <w:rFonts w:ascii="Calibri" w:hAnsi="Calibri" w:eastAsia="Calibri"/>
+        <w:color w:val="999999"/>
         <w:sz w:val="18"/>
-        <w:color w:val="999999"/>
       </w:rPr>
       <w:fldChar w:fldCharType="end"/>
     </w:r>

</xml_diff>